<commit_message>
Update PLTW application with confirmed PandaDoc/Adobe Sign and K-12 connection (score 72 -> 77)
Added two new confirmed facts to master-profile.md: hands-on PandaDoc
and Adobe Sign experience for agreement/e-signature workflows, and a
genuine personal connection to K-12 education (Josh's wife is a
PreK-6 vice principal). Both are real, both used honestly, neither
is professional K-12 industry experience.

Rebuilt the PLTW resume and cover letter to reflect the tool
confirmation and the personal connection, and rescored: 72 -> 77.
Still short of the 80+ band on genuine content (no formal contract/
procurement-administration ownership, no professional K-12 experience)
rather than presentation, stated plainly in the match report.

Co-Authored-By: Claude Sonnet 5 <noreply@anthropic.com>
Claude-Session: https://claude.ai/code/session_01NbVZsCcsxhZmD6mekvh8hj
</commit_message>
<xml_diff>
--- a/applications/pltw-engagement-operations-specialist/PLTW-Engagement-Operations-Specialist-CoverLetter.docx
+++ b/applications/pltw-engagement-operations-specialist/PLTW-Engagement-Operations-Specialist-CoverLetter.docx
@@ -107,7 +107,7 @@
           <w:b w:val="0"/>
           <w:color w:val="1A1A1A"/>
         </w:rPr>
-        <w:t>Salesforce has been my primary CRM at two employers, Birdeye and Wix, where I managed account and pipeline records, renewal-relevant customer health data, and cross-functional communication. At Birdeye I onboarded and managed 15 to 20 reseller partners across health, home services, and retail, retaining all but one. At Level Agency I advised client businesses directly on ad-spend budget planning and allocation. Across every role, the common thread is being the person who keeps a multi-stakeholder process, an implementation, a renewal, an agreement, from stalling.</w:t>
+        <w:t>Salesforce has been my primary CRM at two employers, Birdeye and Wix, where I managed account and pipeline records, renewal-relevant customer health data, and cross-functional communication. At Birdeye I onboarded and managed 15 to 20 reseller partners across health, home services, and retail, retaining all but one. At Level Agency I advised client businesses directly on ad-spend budget planning and allocation. I've also sent and managed agreements through both PandaDoc and Adobe Sign, so the e-signature and agreement-tracking side of this role isn't new either. Across every role, the common thread is being the person who keeps a multi-stakeholder process, an implementation, a renewal, an agreement, from stalling.</w:t>
       </w:r>
     </w:p>
     <w:p>
@@ -120,7 +120,7 @@
           <w:b w:val="0"/>
           <w:color w:val="1A1A1A"/>
         </w:rPr>
-        <w:t>I don't have direct K-12 or school-district purchasing experience, and I want to say that plainly rather than imply otherwise. What I bring is the deal-coordination and CRM discipline this role runs on, and I would learn the education-purchasing specifics fast. I would welcome the chance to talk through how I would approach the first 90 days.</w:t>
+        <w:t>I don't have direct K-12 or school-district purchasing experience, and I want to say that plainly rather than imply otherwise. What I do have is a close view of how school administration actually runs: my wife is a PreK-6 vice principal, so district processes and school-year timelines aren't abstract to me. Paired with the deal-coordination and CRM discipline this role runs on, I'd pick up the purchasing specifics fast. I would welcome the chance to talk through how I would approach the first 90 days.</w:t>
       </w:r>
     </w:p>
     <w:p>

</xml_diff>